<commit_message>
Updated ETL pipeline, fixed database connection with dashboard
</commit_message>
<xml_diff>
--- a/docs/Project Instructions.docx
+++ b/docs/Project Instructions.docx
@@ -105,14 +105,7 @@
           <w:b/>
           <w:bCs/>
         </w:rPr>
-        <w:t>data</w:t>
-      </w:r>
-      <w:r>
-        <w:rPr>
-          <w:b/>
-          <w:bCs/>
-        </w:rPr>
-        <w:t xml:space="preserve"> pipeline</w:t>
+        <w:t>data pipeline</w:t>
       </w:r>
       <w:r>
         <w:t xml:space="preserve"> that extracts data from the </w:t>
@@ -388,7 +381,6 @@
                 <w14:ligatures w14:val="none"/>
               </w:rPr>
             </w:pPr>
-            <w:proofErr w:type="spellStart"/>
             <w:r>
               <w:rPr>
                 <w:rFonts w:ascii="Aptos Narrow" w:eastAsia="Times New Roman" w:hAnsi="Aptos Narrow" w:cs="Times New Roman"/>
@@ -400,7 +392,6 @@
               </w:rPr>
               <w:t>trial_id</w:t>
             </w:r>
-            <w:proofErr w:type="spellEnd"/>
           </w:p>
         </w:tc>
         <w:tc>
@@ -514,7 +505,6 @@
                 <w14:ligatures w14:val="none"/>
               </w:rPr>
             </w:pPr>
-            <w:proofErr w:type="spellStart"/>
             <w:r>
               <w:rPr>
                 <w:rFonts w:ascii="Aptos Narrow" w:eastAsia="Times New Roman" w:hAnsi="Aptos Narrow" w:cs="Times New Roman"/>
@@ -526,7 +516,6 @@
               </w:rPr>
               <w:t>nct_id</w:t>
             </w:r>
-            <w:proofErr w:type="spellEnd"/>
           </w:p>
         </w:tc>
         <w:tc>
@@ -1046,7 +1035,6 @@
                 <w14:ligatures w14:val="none"/>
               </w:rPr>
             </w:pPr>
-            <w:proofErr w:type="spellStart"/>
             <w:r>
               <w:rPr>
                 <w:rFonts w:ascii="Aptos Narrow" w:eastAsia="Times New Roman" w:hAnsi="Aptos Narrow" w:cs="Times New Roman"/>
@@ -1058,7 +1046,6 @@
               </w:rPr>
               <w:t>sponsor_id</w:t>
             </w:r>
-            <w:proofErr w:type="spellEnd"/>
           </w:p>
         </w:tc>
         <w:tc>
@@ -1117,44 +1104,7 @@
                 <w:szCs w:val="20"/>
                 <w14:ligatures w14:val="none"/>
               </w:rPr>
-              <w:t xml:space="preserve">Foreign Key (references </w:t>
-            </w:r>
-            <w:proofErr w:type="spellStart"/>
-            <w:proofErr w:type="gramStart"/>
-            <w:r>
-              <w:rPr>
-                <w:rFonts w:ascii="Aptos Narrow" w:eastAsia="Times New Roman" w:hAnsi="Aptos Narrow" w:cs="Times New Roman"/>
-                <w:color w:val="000000"/>
-                <w:kern w:val="0"/>
-                <w:sz w:val="20"/>
-                <w:szCs w:val="20"/>
-                <w14:ligatures w14:val="none"/>
-              </w:rPr>
-              <w:t>sponsors.sponsor</w:t>
-            </w:r>
-            <w:proofErr w:type="gramEnd"/>
-            <w:r>
-              <w:rPr>
-                <w:rFonts w:ascii="Aptos Narrow" w:eastAsia="Times New Roman" w:hAnsi="Aptos Narrow" w:cs="Times New Roman"/>
-                <w:color w:val="000000"/>
-                <w:kern w:val="0"/>
-                <w:sz w:val="20"/>
-                <w:szCs w:val="20"/>
-                <w14:ligatures w14:val="none"/>
-              </w:rPr>
-              <w:t>_id</w:t>
-            </w:r>
-            <w:proofErr w:type="spellEnd"/>
-            <w:r>
-              <w:rPr>
-                <w:rFonts w:ascii="Aptos Narrow" w:eastAsia="Times New Roman" w:hAnsi="Aptos Narrow" w:cs="Times New Roman"/>
-                <w:color w:val="000000"/>
-                <w:kern w:val="0"/>
-                <w:sz w:val="20"/>
-                <w:szCs w:val="20"/>
-                <w14:ligatures w14:val="none"/>
-              </w:rPr>
-              <w:t>)</w:t>
+              <w:t>Foreign Key (references sponsors.sponsor_id)</w:t>
             </w:r>
           </w:p>
         </w:tc>
@@ -1437,7 +1387,6 @@
                 <w14:ligatures w14:val="none"/>
               </w:rPr>
             </w:pPr>
-            <w:proofErr w:type="spellStart"/>
             <w:r>
               <w:rPr>
                 <w:rFonts w:ascii="Aptos Narrow" w:eastAsia="Times New Roman" w:hAnsi="Aptos Narrow" w:cs="Times New Roman"/>
@@ -1449,7 +1398,6 @@
               </w:rPr>
               <w:t>condition_id</w:t>
             </w:r>
-            <w:proofErr w:type="spellEnd"/>
           </w:p>
         </w:tc>
         <w:tc>
@@ -1914,7 +1862,6 @@
                 <w14:ligatures w14:val="none"/>
               </w:rPr>
             </w:pPr>
-            <w:proofErr w:type="spellStart"/>
             <w:r>
               <w:rPr>
                 <w:rFonts w:ascii="Aptos Narrow" w:eastAsia="Times New Roman" w:hAnsi="Aptos Narrow" w:cs="Times New Roman"/>
@@ -1926,7 +1873,6 @@
               </w:rPr>
               <w:t>intervention_id</w:t>
             </w:r>
-            <w:proofErr w:type="spellEnd"/>
           </w:p>
         </w:tc>
         <w:tc>
@@ -2186,7 +2132,6 @@
           <w:szCs w:val="20"/>
         </w:rPr>
       </w:pPr>
-      <w:proofErr w:type="spellStart"/>
       <w:r>
         <w:rPr>
           <w:b/>
@@ -2205,7 +2150,6 @@
         </w:rPr>
         <w:t>rial_conditions</w:t>
       </w:r>
-      <w:proofErr w:type="spellEnd"/>
       <w:r>
         <w:rPr>
           <w:b/>
@@ -2398,7 +2342,6 @@
                 <w14:ligatures w14:val="none"/>
               </w:rPr>
             </w:pPr>
-            <w:proofErr w:type="spellStart"/>
             <w:r>
               <w:rPr>
                 <w:rFonts w:ascii="Aptos Narrow" w:eastAsia="Times New Roman" w:hAnsi="Aptos Narrow" w:cs="Times New Roman"/>
@@ -2410,7 +2353,6 @@
               </w:rPr>
               <w:t>trial_id</w:t>
             </w:r>
-            <w:proofErr w:type="spellEnd"/>
           </w:p>
         </w:tc>
         <w:tc>
@@ -2469,44 +2411,7 @@
                 <w:szCs w:val="20"/>
                 <w14:ligatures w14:val="none"/>
               </w:rPr>
-              <w:t xml:space="preserve">Foreign Key (references </w:t>
-            </w:r>
-            <w:proofErr w:type="spellStart"/>
-            <w:proofErr w:type="gramStart"/>
-            <w:r>
-              <w:rPr>
-                <w:rFonts w:ascii="Aptos Narrow" w:eastAsia="Times New Roman" w:hAnsi="Aptos Narrow" w:cs="Times New Roman"/>
-                <w:color w:val="000000"/>
-                <w:kern w:val="0"/>
-                <w:sz w:val="20"/>
-                <w:szCs w:val="20"/>
-                <w14:ligatures w14:val="none"/>
-              </w:rPr>
-              <w:t>trials.trial</w:t>
-            </w:r>
-            <w:proofErr w:type="gramEnd"/>
-            <w:r>
-              <w:rPr>
-                <w:rFonts w:ascii="Aptos Narrow" w:eastAsia="Times New Roman" w:hAnsi="Aptos Narrow" w:cs="Times New Roman"/>
-                <w:color w:val="000000"/>
-                <w:kern w:val="0"/>
-                <w:sz w:val="20"/>
-                <w:szCs w:val="20"/>
-                <w14:ligatures w14:val="none"/>
-              </w:rPr>
-              <w:t>_id</w:t>
-            </w:r>
-            <w:proofErr w:type="spellEnd"/>
-            <w:r>
-              <w:rPr>
-                <w:rFonts w:ascii="Aptos Narrow" w:eastAsia="Times New Roman" w:hAnsi="Aptos Narrow" w:cs="Times New Roman"/>
-                <w:color w:val="000000"/>
-                <w:kern w:val="0"/>
-                <w:sz w:val="20"/>
-                <w:szCs w:val="20"/>
-                <w14:ligatures w14:val="none"/>
-              </w:rPr>
-              <w:t>)</w:t>
+              <w:t>Foreign Key (references trials.trial_id)</w:t>
             </w:r>
           </w:p>
         </w:tc>
@@ -2562,7 +2467,6 @@
                 <w14:ligatures w14:val="none"/>
               </w:rPr>
             </w:pPr>
-            <w:proofErr w:type="spellStart"/>
             <w:r>
               <w:rPr>
                 <w:rFonts w:ascii="Aptos Narrow" w:eastAsia="Times New Roman" w:hAnsi="Aptos Narrow" w:cs="Times New Roman"/>
@@ -2574,7 +2478,6 @@
               </w:rPr>
               <w:t>condition_id</w:t>
             </w:r>
-            <w:proofErr w:type="spellEnd"/>
           </w:p>
         </w:tc>
         <w:tc>
@@ -2633,44 +2536,7 @@
                 <w:szCs w:val="20"/>
                 <w14:ligatures w14:val="none"/>
               </w:rPr>
-              <w:t xml:space="preserve">Foreign Key (references </w:t>
-            </w:r>
-            <w:proofErr w:type="spellStart"/>
-            <w:proofErr w:type="gramStart"/>
-            <w:r>
-              <w:rPr>
-                <w:rFonts w:ascii="Aptos Narrow" w:eastAsia="Times New Roman" w:hAnsi="Aptos Narrow" w:cs="Times New Roman"/>
-                <w:color w:val="000000"/>
-                <w:kern w:val="0"/>
-                <w:sz w:val="20"/>
-                <w:szCs w:val="20"/>
-                <w14:ligatures w14:val="none"/>
-              </w:rPr>
-              <w:t>conditions.condition</w:t>
-            </w:r>
-            <w:proofErr w:type="gramEnd"/>
-            <w:r>
-              <w:rPr>
-                <w:rFonts w:ascii="Aptos Narrow" w:eastAsia="Times New Roman" w:hAnsi="Aptos Narrow" w:cs="Times New Roman"/>
-                <w:color w:val="000000"/>
-                <w:kern w:val="0"/>
-                <w:sz w:val="20"/>
-                <w:szCs w:val="20"/>
-                <w14:ligatures w14:val="none"/>
-              </w:rPr>
-              <w:t>_id</w:t>
-            </w:r>
-            <w:proofErr w:type="spellEnd"/>
-            <w:r>
-              <w:rPr>
-                <w:rFonts w:ascii="Aptos Narrow" w:eastAsia="Times New Roman" w:hAnsi="Aptos Narrow" w:cs="Times New Roman"/>
-                <w:color w:val="000000"/>
-                <w:kern w:val="0"/>
-                <w:sz w:val="20"/>
-                <w:szCs w:val="20"/>
-                <w14:ligatures w14:val="none"/>
-              </w:rPr>
-              <w:t>)</w:t>
+              <w:t>Foreign Key (references conditions.condition_id)</w:t>
             </w:r>
           </w:p>
         </w:tc>
@@ -2765,55 +2631,7 @@
                 <w:szCs w:val="20"/>
                 <w14:ligatures w14:val="none"/>
               </w:rPr>
-              <w:t>(</w:t>
-            </w:r>
-            <w:proofErr w:type="spellStart"/>
-            <w:r>
-              <w:rPr>
-                <w:rFonts w:ascii="Aptos Narrow" w:eastAsia="Times New Roman" w:hAnsi="Aptos Narrow" w:cs="Times New Roman"/>
-                <w:color w:val="000000"/>
-                <w:kern w:val="0"/>
-                <w:sz w:val="20"/>
-                <w:szCs w:val="20"/>
-                <w14:ligatures w14:val="none"/>
-              </w:rPr>
-              <w:t>trial_id</w:t>
-            </w:r>
-            <w:proofErr w:type="spellEnd"/>
-            <w:r>
-              <w:rPr>
-                <w:rFonts w:ascii="Aptos Narrow" w:eastAsia="Times New Roman" w:hAnsi="Aptos Narrow" w:cs="Times New Roman"/>
-                <w:color w:val="000000"/>
-                <w:kern w:val="0"/>
-                <w:sz w:val="20"/>
-                <w:szCs w:val="20"/>
-                <w14:ligatures w14:val="none"/>
-              </w:rPr>
-              <w:t xml:space="preserve">, </w:t>
-            </w:r>
-            <w:proofErr w:type="spellStart"/>
-            <w:r>
-              <w:rPr>
-                <w:rFonts w:ascii="Aptos Narrow" w:eastAsia="Times New Roman" w:hAnsi="Aptos Narrow" w:cs="Times New Roman"/>
-                <w:color w:val="000000"/>
-                <w:kern w:val="0"/>
-                <w:sz w:val="20"/>
-                <w:szCs w:val="20"/>
-                <w14:ligatures w14:val="none"/>
-              </w:rPr>
-              <w:t>condition_id</w:t>
-            </w:r>
-            <w:proofErr w:type="spellEnd"/>
-            <w:r>
-              <w:rPr>
-                <w:rFonts w:ascii="Aptos Narrow" w:eastAsia="Times New Roman" w:hAnsi="Aptos Narrow" w:cs="Times New Roman"/>
-                <w:color w:val="000000"/>
-                <w:kern w:val="0"/>
-                <w:sz w:val="20"/>
-                <w:szCs w:val="20"/>
-                <w14:ligatures w14:val="none"/>
-              </w:rPr>
-              <w:t>)</w:t>
+              <w:t>(trial_id, condition_id)</w:t>
             </w:r>
           </w:p>
         </w:tc>
@@ -2915,7 +2733,6 @@
           <w:bCs/>
         </w:rPr>
       </w:pPr>
-      <w:proofErr w:type="spellStart"/>
       <w:r>
         <w:rPr>
           <w:b/>
@@ -2932,17 +2749,7 @@
           <w:sz w:val="20"/>
           <w:szCs w:val="20"/>
         </w:rPr>
-        <w:t>rial_interventions</w:t>
-      </w:r>
-      <w:proofErr w:type="spellEnd"/>
-      <w:r>
-        <w:rPr>
-          <w:b/>
-          <w:bCs/>
-          <w:sz w:val="20"/>
-          <w:szCs w:val="20"/>
-        </w:rPr>
-        <w:t xml:space="preserve">: </w:t>
+        <w:t xml:space="preserve">rial_interventions: </w:t>
       </w:r>
       <w:r>
         <w:rPr>
@@ -3127,7 +2934,6 @@
                 <w14:ligatures w14:val="none"/>
               </w:rPr>
             </w:pPr>
-            <w:proofErr w:type="spellStart"/>
             <w:r>
               <w:rPr>
                 <w:rFonts w:ascii="Aptos Narrow" w:eastAsia="Times New Roman" w:hAnsi="Aptos Narrow" w:cs="Times New Roman"/>
@@ -3139,7 +2945,6 @@
               </w:rPr>
               <w:t>trial_id</w:t>
             </w:r>
-            <w:proofErr w:type="spellEnd"/>
           </w:p>
         </w:tc>
         <w:tc>
@@ -3198,44 +3003,7 @@
                 <w:szCs w:val="20"/>
                 <w14:ligatures w14:val="none"/>
               </w:rPr>
-              <w:t xml:space="preserve">Foreign Key (references </w:t>
-            </w:r>
-            <w:proofErr w:type="spellStart"/>
-            <w:proofErr w:type="gramStart"/>
-            <w:r>
-              <w:rPr>
-                <w:rFonts w:ascii="Aptos Narrow" w:eastAsia="Times New Roman" w:hAnsi="Aptos Narrow" w:cs="Times New Roman"/>
-                <w:color w:val="000000"/>
-                <w:kern w:val="0"/>
-                <w:sz w:val="20"/>
-                <w:szCs w:val="20"/>
-                <w14:ligatures w14:val="none"/>
-              </w:rPr>
-              <w:t>trials.trial</w:t>
-            </w:r>
-            <w:proofErr w:type="gramEnd"/>
-            <w:r>
-              <w:rPr>
-                <w:rFonts w:ascii="Aptos Narrow" w:eastAsia="Times New Roman" w:hAnsi="Aptos Narrow" w:cs="Times New Roman"/>
-                <w:color w:val="000000"/>
-                <w:kern w:val="0"/>
-                <w:sz w:val="20"/>
-                <w:szCs w:val="20"/>
-                <w14:ligatures w14:val="none"/>
-              </w:rPr>
-              <w:t>_id</w:t>
-            </w:r>
-            <w:proofErr w:type="spellEnd"/>
-            <w:r>
-              <w:rPr>
-                <w:rFonts w:ascii="Aptos Narrow" w:eastAsia="Times New Roman" w:hAnsi="Aptos Narrow" w:cs="Times New Roman"/>
-                <w:color w:val="000000"/>
-                <w:kern w:val="0"/>
-                <w:sz w:val="20"/>
-                <w:szCs w:val="20"/>
-                <w14:ligatures w14:val="none"/>
-              </w:rPr>
-              <w:t>)</w:t>
+              <w:t>Foreign Key (references trials.trial_id)</w:t>
             </w:r>
           </w:p>
         </w:tc>
@@ -3291,7 +3059,6 @@
                 <w14:ligatures w14:val="none"/>
               </w:rPr>
             </w:pPr>
-            <w:proofErr w:type="spellStart"/>
             <w:r>
               <w:rPr>
                 <w:rFonts w:ascii="Aptos Narrow" w:eastAsia="Times New Roman" w:hAnsi="Aptos Narrow" w:cs="Times New Roman"/>
@@ -3303,7 +3070,6 @@
               </w:rPr>
               <w:t>intervention_id</w:t>
             </w:r>
-            <w:proofErr w:type="spellEnd"/>
           </w:p>
         </w:tc>
         <w:tc>
@@ -3362,44 +3128,7 @@
                 <w:szCs w:val="20"/>
                 <w14:ligatures w14:val="none"/>
               </w:rPr>
-              <w:t xml:space="preserve">Foreign Key (references </w:t>
-            </w:r>
-            <w:proofErr w:type="spellStart"/>
-            <w:proofErr w:type="gramStart"/>
-            <w:r>
-              <w:rPr>
-                <w:rFonts w:ascii="Aptos Narrow" w:eastAsia="Times New Roman" w:hAnsi="Aptos Narrow" w:cs="Times New Roman"/>
-                <w:color w:val="000000"/>
-                <w:kern w:val="0"/>
-                <w:sz w:val="20"/>
-                <w:szCs w:val="20"/>
-                <w14:ligatures w14:val="none"/>
-              </w:rPr>
-              <w:t>interventions.intervention</w:t>
-            </w:r>
-            <w:proofErr w:type="gramEnd"/>
-            <w:r>
-              <w:rPr>
-                <w:rFonts w:ascii="Aptos Narrow" w:eastAsia="Times New Roman" w:hAnsi="Aptos Narrow" w:cs="Times New Roman"/>
-                <w:color w:val="000000"/>
-                <w:kern w:val="0"/>
-                <w:sz w:val="20"/>
-                <w:szCs w:val="20"/>
-                <w14:ligatures w14:val="none"/>
-              </w:rPr>
-              <w:t>_id</w:t>
-            </w:r>
-            <w:proofErr w:type="spellEnd"/>
-            <w:r>
-              <w:rPr>
-                <w:rFonts w:ascii="Aptos Narrow" w:eastAsia="Times New Roman" w:hAnsi="Aptos Narrow" w:cs="Times New Roman"/>
-                <w:color w:val="000000"/>
-                <w:kern w:val="0"/>
-                <w:sz w:val="20"/>
-                <w:szCs w:val="20"/>
-                <w14:ligatures w14:val="none"/>
-              </w:rPr>
-              <w:t>)</w:t>
+              <w:t>Foreign Key (references interventions.intervention_id)</w:t>
             </w:r>
           </w:p>
         </w:tc>
@@ -3494,55 +3223,7 @@
                 <w:szCs w:val="20"/>
                 <w14:ligatures w14:val="none"/>
               </w:rPr>
-              <w:t>(</w:t>
-            </w:r>
-            <w:proofErr w:type="spellStart"/>
-            <w:r>
-              <w:rPr>
-                <w:rFonts w:ascii="Aptos Narrow" w:eastAsia="Times New Roman" w:hAnsi="Aptos Narrow" w:cs="Times New Roman"/>
-                <w:color w:val="000000"/>
-                <w:kern w:val="0"/>
-                <w:sz w:val="20"/>
-                <w:szCs w:val="20"/>
-                <w14:ligatures w14:val="none"/>
-              </w:rPr>
-              <w:t>trial_id</w:t>
-            </w:r>
-            <w:proofErr w:type="spellEnd"/>
-            <w:r>
-              <w:rPr>
-                <w:rFonts w:ascii="Aptos Narrow" w:eastAsia="Times New Roman" w:hAnsi="Aptos Narrow" w:cs="Times New Roman"/>
-                <w:color w:val="000000"/>
-                <w:kern w:val="0"/>
-                <w:sz w:val="20"/>
-                <w:szCs w:val="20"/>
-                <w14:ligatures w14:val="none"/>
-              </w:rPr>
-              <w:t xml:space="preserve">, </w:t>
-            </w:r>
-            <w:proofErr w:type="spellStart"/>
-            <w:r>
-              <w:rPr>
-                <w:rFonts w:ascii="Aptos Narrow" w:eastAsia="Times New Roman" w:hAnsi="Aptos Narrow" w:cs="Times New Roman"/>
-                <w:color w:val="000000"/>
-                <w:kern w:val="0"/>
-                <w:sz w:val="20"/>
-                <w:szCs w:val="20"/>
-                <w14:ligatures w14:val="none"/>
-              </w:rPr>
-              <w:t>intervention_id</w:t>
-            </w:r>
-            <w:proofErr w:type="spellEnd"/>
-            <w:r>
-              <w:rPr>
-                <w:rFonts w:ascii="Aptos Narrow" w:eastAsia="Times New Roman" w:hAnsi="Aptos Narrow" w:cs="Times New Roman"/>
-                <w:color w:val="000000"/>
-                <w:kern w:val="0"/>
-                <w:sz w:val="20"/>
-                <w:szCs w:val="20"/>
-                <w14:ligatures w14:val="none"/>
-              </w:rPr>
-              <w:t>)</w:t>
+              <w:t>(trial_id, intervention_id)</w:t>
             </w:r>
           </w:p>
         </w:tc>
@@ -3825,7 +3506,6 @@
                 <w14:ligatures w14:val="none"/>
               </w:rPr>
             </w:pPr>
-            <w:proofErr w:type="spellStart"/>
             <w:r>
               <w:rPr>
                 <w:rFonts w:ascii="Aptos Narrow" w:eastAsia="Times New Roman" w:hAnsi="Aptos Narrow" w:cs="Times New Roman"/>
@@ -3837,7 +3517,6 @@
               </w:rPr>
               <w:t>sponsor_id</w:t>
             </w:r>
-            <w:proofErr w:type="spellEnd"/>
           </w:p>
         </w:tc>
         <w:tc>
@@ -4300,7 +3979,6 @@
                 <w14:ligatures w14:val="none"/>
               </w:rPr>
             </w:pPr>
-            <w:proofErr w:type="spellStart"/>
             <w:r>
               <w:rPr>
                 <w:rFonts w:ascii="Aptos Narrow" w:eastAsia="Times New Roman" w:hAnsi="Aptos Narrow" w:cs="Times New Roman"/>
@@ -4312,7 +3990,6 @@
               </w:rPr>
               <w:t>location_id</w:t>
             </w:r>
-            <w:proofErr w:type="spellEnd"/>
           </w:p>
         </w:tc>
         <w:tc>
@@ -4427,7 +4104,6 @@
                 <w14:ligatures w14:val="none"/>
               </w:rPr>
             </w:pPr>
-            <w:proofErr w:type="spellStart"/>
             <w:r>
               <w:rPr>
                 <w:rFonts w:ascii="Aptos Narrow" w:eastAsia="Times New Roman" w:hAnsi="Aptos Narrow" w:cs="Times New Roman"/>
@@ -4439,7 +4115,6 @@
               </w:rPr>
               <w:t>trial_id</w:t>
             </w:r>
-            <w:proofErr w:type="spellEnd"/>
           </w:p>
         </w:tc>
         <w:tc>
@@ -4498,44 +4173,7 @@
                 <w:szCs w:val="20"/>
                 <w14:ligatures w14:val="none"/>
               </w:rPr>
-              <w:t xml:space="preserve">Foreign Key (references </w:t>
-            </w:r>
-            <w:proofErr w:type="spellStart"/>
-            <w:proofErr w:type="gramStart"/>
-            <w:r>
-              <w:rPr>
-                <w:rFonts w:ascii="Aptos Narrow" w:eastAsia="Times New Roman" w:hAnsi="Aptos Narrow" w:cs="Times New Roman"/>
-                <w:color w:val="000000"/>
-                <w:kern w:val="0"/>
-                <w:sz w:val="20"/>
-                <w:szCs w:val="20"/>
-                <w14:ligatures w14:val="none"/>
-              </w:rPr>
-              <w:t>trials.trial</w:t>
-            </w:r>
-            <w:proofErr w:type="gramEnd"/>
-            <w:r>
-              <w:rPr>
-                <w:rFonts w:ascii="Aptos Narrow" w:eastAsia="Times New Roman" w:hAnsi="Aptos Narrow" w:cs="Times New Roman"/>
-                <w:color w:val="000000"/>
-                <w:kern w:val="0"/>
-                <w:sz w:val="20"/>
-                <w:szCs w:val="20"/>
-                <w14:ligatures w14:val="none"/>
-              </w:rPr>
-              <w:t>_id</w:t>
-            </w:r>
-            <w:proofErr w:type="spellEnd"/>
-            <w:r>
-              <w:rPr>
-                <w:rFonts w:ascii="Aptos Narrow" w:eastAsia="Times New Roman" w:hAnsi="Aptos Narrow" w:cs="Times New Roman"/>
-                <w:color w:val="000000"/>
-                <w:kern w:val="0"/>
-                <w:sz w:val="20"/>
-                <w:szCs w:val="20"/>
-                <w14:ligatures w14:val="none"/>
-              </w:rPr>
-              <w:t>)</w:t>
+              <w:t>Foreign Key (references trials.trial_id)</w:t>
             </w:r>
           </w:p>
         </w:tc>
@@ -4917,7 +4555,6 @@
           <w:szCs w:val="20"/>
         </w:rPr>
       </w:pPr>
-      <w:proofErr w:type="spellStart"/>
       <w:r>
         <w:rPr>
           <w:b/>
@@ -4936,7 +4573,6 @@
         </w:rPr>
         <w:t>og_pages</w:t>
       </w:r>
-      <w:proofErr w:type="spellEnd"/>
       <w:r>
         <w:rPr>
           <w:b/>
@@ -5143,7 +4779,6 @@
                 <w14:ligatures w14:val="none"/>
               </w:rPr>
             </w:pPr>
-            <w:proofErr w:type="spellStart"/>
             <w:r>
               <w:rPr>
                 <w:rFonts w:ascii="Aptos Narrow" w:eastAsia="Times New Roman" w:hAnsi="Aptos Narrow" w:cs="Times New Roman"/>
@@ -5155,7 +4790,6 @@
               </w:rPr>
               <w:t>nextPageToken</w:t>
             </w:r>
-            <w:proofErr w:type="spellEnd"/>
           </w:p>
         </w:tc>
         <w:tc>
@@ -5484,14 +5118,12 @@
           <w:numId w:val="16"/>
         </w:numPr>
       </w:pPr>
-      <w:proofErr w:type="spellStart"/>
       <w:r>
         <w:t>nct</w:t>
       </w:r>
       <w:r>
         <w:t>_id</w:t>
       </w:r>
-      <w:proofErr w:type="spellEnd"/>
     </w:p>
     <w:p>
       <w:pPr>
@@ -5776,37 +5408,12 @@
         </w:numPr>
         <w:spacing w:line="360" w:lineRule="auto"/>
       </w:pPr>
-      <w:proofErr w:type="spellStart"/>
       <w:r>
         <w:rPr>
           <w:b/>
           <w:bCs/>
         </w:rPr>
-        <w:t>Trial_Conditions</w:t>
-      </w:r>
-      <w:proofErr w:type="spellEnd"/>
-      <w:r>
-        <w:rPr>
-          <w:b/>
-          <w:bCs/>
-        </w:rPr>
-        <w:t xml:space="preserve"> and </w:t>
-      </w:r>
-      <w:proofErr w:type="spellStart"/>
-      <w:r>
-        <w:rPr>
-          <w:b/>
-          <w:bCs/>
-        </w:rPr>
-        <w:t>Trial_Interventions</w:t>
-      </w:r>
-      <w:proofErr w:type="spellEnd"/>
-      <w:r>
-        <w:rPr>
-          <w:b/>
-          <w:bCs/>
-        </w:rPr>
-        <w:t xml:space="preserve"> Tables</w:t>
+        <w:t>Trial_Conditions and Trial_Interventions Tables</w:t>
       </w:r>
       <w:r>
         <w:t>: These tables will store the many-to-many relationships between trials and conditions, as well as trials and interventions.</w:t>
@@ -5852,45 +5459,13 @@
         <w:t xml:space="preserve">Trial Information: </w:t>
       </w:r>
       <w:r>
-        <w:t xml:space="preserve">Extract the </w:t>
-      </w:r>
-      <w:proofErr w:type="spellStart"/>
-      <w:r>
-        <w:t>NCTId</w:t>
-      </w:r>
-      <w:proofErr w:type="spellEnd"/>
-      <w:r>
-        <w:t xml:space="preserve"> </w:t>
+        <w:t xml:space="preserve">Extract the NCTId </w:t>
       </w:r>
       <w:r>
         <w:t xml:space="preserve">not </w:t>
       </w:r>
       <w:r>
-        <w:t xml:space="preserve">as </w:t>
-      </w:r>
-      <w:proofErr w:type="spellStart"/>
-      <w:r>
-        <w:t>trial_id</w:t>
-      </w:r>
-      <w:proofErr w:type="spellEnd"/>
-      <w:r>
-        <w:t xml:space="preserve">, use the </w:t>
-      </w:r>
-      <w:proofErr w:type="spellStart"/>
-      <w:r>
-        <w:t>BriefTitle</w:t>
-      </w:r>
-      <w:proofErr w:type="spellEnd"/>
-      <w:r>
-        <w:t xml:space="preserve"> or </w:t>
-      </w:r>
-      <w:proofErr w:type="spellStart"/>
-      <w:r>
-        <w:t>OfficialTitle</w:t>
-      </w:r>
-      <w:proofErr w:type="spellEnd"/>
-      <w:r>
-        <w:t xml:space="preserve"> as the trial title, and map status and phase from the relevant fields.</w:t>
+        <w:t>as trial_id, use the BriefTitle or OfficialTitle as the trial title, and map status and phase from the relevant fields.</w:t>
       </w:r>
     </w:p>
     <w:p>
@@ -5913,23 +5488,7 @@
         <w:t xml:space="preserve">Conditions and Interventions: </w:t>
       </w:r>
       <w:r>
-        <w:t xml:space="preserve">Loop through the conditions and interventions associated with each trial, ensuring each one has a unique </w:t>
-      </w:r>
-      <w:proofErr w:type="spellStart"/>
-      <w:r>
-        <w:t>condition_id</w:t>
-      </w:r>
-      <w:proofErr w:type="spellEnd"/>
-      <w:r>
-        <w:t xml:space="preserve"> or </w:t>
-      </w:r>
-      <w:proofErr w:type="spellStart"/>
-      <w:r>
-        <w:t>intervention_id</w:t>
-      </w:r>
-      <w:proofErr w:type="spellEnd"/>
-      <w:r>
-        <w:t>. This may involve checking if the condition or intervention already exists in the database to avoid duplicates.</w:t>
+        <w:t>Loop through the conditions and interventions associated with each trial, ensuring each one has a unique condition_id or intervention_id. This may involve checking if the condition or intervention already exists in the database to avoid duplicates.</w:t>
       </w:r>
     </w:p>
     <w:p>
@@ -5959,23 +5518,7 @@
         <w:t>on</w:t>
       </w:r>
       <w:r>
-        <w:t xml:space="preserve"> the </w:t>
-      </w:r>
-      <w:proofErr w:type="gramStart"/>
-      <w:r>
-        <w:t>sponsors</w:t>
-      </w:r>
-      <w:proofErr w:type="gramEnd"/>
-      <w:r>
-        <w:t xml:space="preserve"> table. If the sponsor is new, it needs to be inserted into the </w:t>
-      </w:r>
-      <w:proofErr w:type="gramStart"/>
-      <w:r>
-        <w:t>sponsors</w:t>
-      </w:r>
-      <w:proofErr w:type="gramEnd"/>
-      <w:r>
-        <w:t xml:space="preserve"> table.</w:t>
+        <w:t xml:space="preserve"> the sponsors table. If the sponsor is new, it needs to be inserted into the sponsors table.</w:t>
       </w:r>
     </w:p>
     <w:p>
@@ -6064,15 +5607,7 @@
         <w:t>Trials Table:</w:t>
       </w:r>
       <w:r>
-        <w:t xml:space="preserve"> Retrieve the last </w:t>
-      </w:r>
-      <w:proofErr w:type="spellStart"/>
-      <w:r>
-        <w:t>trial_id</w:t>
-      </w:r>
-      <w:proofErr w:type="spellEnd"/>
-      <w:r>
-        <w:t xml:space="preserve"> and any existing trial titles to ensure no new trial entries duplicate existing trials based on the title or other unique identifiers.</w:t>
+        <w:t xml:space="preserve"> Retrieve the last trial_id and any existing trial titles to ensure no new trial entries duplicate existing trials based on the title or other unique identifiers.</w:t>
       </w:r>
     </w:p>
     <w:p>
@@ -6091,15 +5626,7 @@
         <w:t>Conditions Table:</w:t>
       </w:r>
       <w:r>
-        <w:t xml:space="preserve"> Retrieve the last </w:t>
-      </w:r>
-      <w:proofErr w:type="spellStart"/>
-      <w:r>
-        <w:t>condition_id</w:t>
-      </w:r>
-      <w:proofErr w:type="spellEnd"/>
-      <w:r>
-        <w:t xml:space="preserve"> and a list of existing condition names (e.g., "Lung Cancer") to check if the condition already exists in the database before insertion.</w:t>
+        <w:t xml:space="preserve"> Retrieve the last condition_id and a list of existing condition names (e.g., "Lung Cancer") to check if the condition already exists in the database before insertion.</w:t>
       </w:r>
     </w:p>
     <w:p>
@@ -6118,15 +5645,7 @@
         <w:t>Interventions Table:</w:t>
       </w:r>
       <w:r>
-        <w:t xml:space="preserve"> Retrieve the last </w:t>
-      </w:r>
-      <w:proofErr w:type="spellStart"/>
-      <w:r>
-        <w:t>intervention_id</w:t>
-      </w:r>
-      <w:proofErr w:type="spellEnd"/>
-      <w:r>
-        <w:t xml:space="preserve"> and the existing names of interventions (e.g., "Chemotherapy") to avoid duplicating existing intervention entries.</w:t>
+        <w:t xml:space="preserve"> Retrieve the last intervention_id and the existing names of interventions (e.g., "Chemotherapy") to avoid duplicating existing intervention entries.</w:t>
       </w:r>
     </w:p>
     <w:p>
@@ -6145,15 +5664,7 @@
         <w:t>Sponsors Table:</w:t>
       </w:r>
       <w:r>
-        <w:t xml:space="preserve"> Retrieve the last </w:t>
-      </w:r>
-      <w:proofErr w:type="spellStart"/>
-      <w:r>
-        <w:t>sponsor_id</w:t>
-      </w:r>
-      <w:proofErr w:type="spellEnd"/>
-      <w:r>
-        <w:t xml:space="preserve"> and the existing sponsor names to check if the sponsor already exists in the database, and if so, map the sponsor accordingly. If not, insert a new record.</w:t>
+        <w:t xml:space="preserve"> Retrieve the last sponsor_id and the existing sponsor names to check if the sponsor already exists in the database, and if so, map the sponsor accordingly. If not, insert a new record.</w:t>
       </w:r>
     </w:p>
     <w:p>
@@ -6172,15 +5683,7 @@
         <w:t>Locations Table:</w:t>
       </w:r>
       <w:r>
-        <w:t xml:space="preserve"> If location information is part of the database schema, retrieve the last </w:t>
-      </w:r>
-      <w:proofErr w:type="spellStart"/>
-      <w:r>
-        <w:t>location_id</w:t>
-      </w:r>
-      <w:proofErr w:type="spellEnd"/>
-      <w:r>
-        <w:t xml:space="preserve"> and any existing location names (e.g., "New York") to avoid duplication and ensure proper mapping of locations to trials.</w:t>
+        <w:t xml:space="preserve"> If location information is part of the database schema, retrieve the last location_id and any existing location names (e.g., "New York") to avoid duplication and ensure proper mapping of locations to trials.</w:t>
       </w:r>
     </w:p>
     <w:p>
@@ -6397,23 +5900,7 @@
         <w:t>Trials Table</w:t>
       </w:r>
       <w:r>
-        <w:t xml:space="preserve">: Insert each trial's data (e.g., </w:t>
-      </w:r>
-      <w:proofErr w:type="spellStart"/>
-      <w:r>
-        <w:t>trial_id</w:t>
-      </w:r>
-      <w:proofErr w:type="spellEnd"/>
-      <w:r>
-        <w:t xml:space="preserve">, title, status, phase, and </w:t>
-      </w:r>
-      <w:proofErr w:type="spellStart"/>
-      <w:r>
-        <w:t>sponsor_id</w:t>
-      </w:r>
-      <w:proofErr w:type="spellEnd"/>
-      <w:r>
-        <w:t>).</w:t>
+        <w:t>: Insert each trial's data (e.g., trial_id, title, status, phase, and sponsor_id).</w:t>
       </w:r>
     </w:p>
     <w:p>
@@ -6453,23 +5940,7 @@
         <w:t>Many-to-Many Relationship Tables</w:t>
       </w:r>
       <w:r>
-        <w:t xml:space="preserve">: Insert the corresponding trial-condition and trial-intervention relationships into the </w:t>
-      </w:r>
-      <w:proofErr w:type="spellStart"/>
-      <w:r>
-        <w:t>trial_conditions</w:t>
-      </w:r>
-      <w:proofErr w:type="spellEnd"/>
-      <w:r>
-        <w:t xml:space="preserve"> and </w:t>
-      </w:r>
-      <w:proofErr w:type="spellStart"/>
-      <w:r>
-        <w:t>trial_interventions</w:t>
-      </w:r>
-      <w:proofErr w:type="spellEnd"/>
-      <w:r>
-        <w:t xml:space="preserve"> tables.</w:t>
+        <w:t>: Insert the corresponding trial-condition and trial-intervention relationships into the trial_conditions and trial_interventions tables.</w:t>
       </w:r>
     </w:p>
     <w:p>
@@ -7522,15 +6993,8 @@
         <w:ind w:left="1800"/>
       </w:pPr>
       <w:r>
-        <w:t xml:space="preserve">Source: </w:t>
-      </w:r>
-      <w:proofErr w:type="spellStart"/>
-      <w:proofErr w:type="gramStart"/>
-      <w:r>
-        <w:t>trials.status</w:t>
-      </w:r>
-      <w:proofErr w:type="spellEnd"/>
-      <w:proofErr w:type="gramEnd"/>
+        <w:t>Source: trials.status</w:t>
+      </w:r>
     </w:p>
     <w:p>
       <w:pPr>
@@ -7593,15 +7057,8 @@
         <w:ind w:left="1800"/>
       </w:pPr>
       <w:r>
-        <w:t xml:space="preserve">Source: </w:t>
-      </w:r>
-      <w:proofErr w:type="spellStart"/>
-      <w:proofErr w:type="gramStart"/>
-      <w:r>
-        <w:t>trials.phase</w:t>
-      </w:r>
-      <w:proofErr w:type="spellEnd"/>
-      <w:proofErr w:type="gramEnd"/>
+        <w:t>Source: trials.phase</w:t>
+      </w:r>
     </w:p>
     <w:p>
       <w:pPr>
@@ -7793,15 +7250,7 @@
         <w:ind w:left="1800"/>
       </w:pPr>
       <w:r>
-        <w:t xml:space="preserve">Join: </w:t>
-      </w:r>
-      <w:proofErr w:type="spellStart"/>
-      <w:r>
-        <w:t>trial_conditions</w:t>
-      </w:r>
-      <w:proofErr w:type="spellEnd"/>
-      <w:r>
-        <w:t xml:space="preserve"> → conditions</w:t>
+        <w:t>Join: trial_conditions → conditions</w:t>
       </w:r>
     </w:p>
     <w:p>
@@ -7881,15 +7330,7 @@
         <w:ind w:left="1800"/>
       </w:pPr>
       <w:r>
-        <w:t xml:space="preserve">Join: </w:t>
-      </w:r>
-      <w:proofErr w:type="spellStart"/>
-      <w:r>
-        <w:t>trial_interventions</w:t>
-      </w:r>
-      <w:proofErr w:type="spellEnd"/>
-      <w:r>
-        <w:t xml:space="preserve"> → interventions</w:t>
+        <w:t>Join: trial_interventions → interventions</w:t>
       </w:r>
     </w:p>
     <w:p>
@@ -8084,7 +7525,7 @@
       </w:pPr>
       <w:r>
         <w:rPr>
-          <w:rFonts w:ascii="Times New Roman" w:eastAsia="Times New Roman" w:hAnsi="Times New Roman" w:cs="Times New Roman"/>
+          <w:rFonts w:eastAsia="Times New Roman" w:cs="Times New Roman"/>
           <w:b/>
           <w:bCs/>
           <w:kern w:val="0"/>
@@ -8103,7 +7544,7 @@
       </w:r>
       <w:r>
         <w:rPr>
-          <w:rFonts w:ascii="Times New Roman" w:eastAsia="Times New Roman" w:hAnsi="Times New Roman" w:cs="Times New Roman"/>
+          <w:rFonts w:eastAsia="Times New Roman" w:cs="Times New Roman"/>
           <w:kern w:val="0"/>
           <w:sz w:val="24"/>
           <w:szCs w:val="24"/>
@@ -8112,10 +7553,7 @@
         <w:t xml:space="preserve"> </w:t>
       </w:r>
       <w:r>
-        <w:t>u</w:t>
-      </w:r>
-      <w:r>
-        <w:t>sed to implement the ETL pipeline, including API extraction, transformation logic, data validation, and database loading.</w:t>
+        <w:t>used to implement the ETL pipeline, including API extraction, transformation logic, data validation, and database loading.</w:t>
       </w:r>
     </w:p>
     <w:p>
@@ -8176,6 +7614,9 @@
       </w:r>
       <w:r>
         <w:t xml:space="preserve"> — for PostgreSQL database connection and inserts</w:t>
+      </w:r>
+      <w:r>
+        <w:t>.</w:t>
       </w:r>
     </w:p>
     <w:p>
@@ -8190,7 +7631,7 @@
       </w:pPr>
       <w:r>
         <w:rPr>
-          <w:rFonts w:ascii="Times New Roman" w:eastAsia="Times New Roman" w:hAnsi="Times New Roman" w:cs="Times New Roman"/>
+          <w:rFonts w:eastAsia="Times New Roman" w:cs="Times New Roman"/>
           <w:b/>
           <w:bCs/>
           <w:kern w:val="0"/>
@@ -8198,16 +7639,41 @@
           <w:szCs w:val="24"/>
           <w14:ligatures w14:val="none"/>
         </w:rPr>
-        <w:t>Database:</w:t>
+        <w:t>PostgreSQL</w:t>
+      </w:r>
+      <w:r>
+        <w:rPr>
+          <w:rFonts w:eastAsia="Times New Roman" w:cs="Times New Roman"/>
+          <w:b/>
+          <w:bCs/>
+          <w:kern w:val="0"/>
+          <w:sz w:val="24"/>
+          <w:szCs w:val="24"/>
+          <w14:ligatures w14:val="none"/>
+        </w:rPr>
+        <w:t>:</w:t>
       </w:r>
       <w:r>
         <w:t xml:space="preserve"> </w:t>
       </w:r>
       <w:r>
-        <w:t xml:space="preserve">PostgreSQL </w:t>
+        <w:rPr>
+          <w:rFonts w:eastAsia="Times New Roman" w:cs="Times New Roman"/>
+          <w:kern w:val="0"/>
+          <w:sz w:val="24"/>
+          <w:szCs w:val="24"/>
+          <w14:ligatures w14:val="none"/>
+        </w:rPr>
+        <w:t>Database</w:t>
+      </w:r>
+      <w:r>
+        <w:t xml:space="preserve"> </w:t>
       </w:r>
       <w:r>
         <w:t>for storing the transformed data</w:t>
+      </w:r>
+      <w:r>
+        <w:t>.</w:t>
       </w:r>
     </w:p>
     <w:p>
@@ -8219,22 +7685,30 @@
         </w:numPr>
         <w:spacing w:line="360" w:lineRule="auto"/>
         <w:ind w:left="1440"/>
-      </w:pPr>
-      <w:r>
-        <w:rPr>
+        <w:rPr>
+          <w:rFonts w:eastAsia="Times New Roman" w:cs="Times New Roman"/>
           <w:b/>
           <w:bCs/>
-        </w:rPr>
-        <w:t>API</w:t>
-      </w:r>
-      <w:r>
-        <w:t xml:space="preserve">: </w:t>
-      </w:r>
-      <w:r>
-        <w:t xml:space="preserve">clinicaltrials.gov </w:t>
-      </w:r>
-      <w:r>
-        <w:t>API for data extraction</w:t>
+          <w:kern w:val="0"/>
+          <w:sz w:val="24"/>
+          <w:szCs w:val="24"/>
+          <w14:ligatures w14:val="none"/>
+        </w:rPr>
+      </w:pPr>
+      <w:r>
+        <w:rPr>
+          <w:rFonts w:eastAsia="Times New Roman" w:cs="Times New Roman"/>
+          <w:b/>
+          <w:bCs/>
+          <w:kern w:val="0"/>
+          <w:sz w:val="24"/>
+          <w:szCs w:val="24"/>
+          <w14:ligatures w14:val="none"/>
+        </w:rPr>
+        <w:t xml:space="preserve">PgAdmin: </w:t>
+      </w:r>
+      <w:r>
+        <w:t>Client Interface for managing PostgreSQL databases, running queries, and monitoring database activity.</w:t>
       </w:r>
     </w:p>
     <w:p>
@@ -8246,16 +7720,98 @@
         </w:numPr>
         <w:spacing w:line="360" w:lineRule="auto"/>
         <w:ind w:left="1440"/>
-      </w:pPr>
-      <w:r>
-        <w:rPr>
+        <w:rPr>
+          <w:rFonts w:eastAsia="Times New Roman" w:cs="Times New Roman"/>
           <w:b/>
           <w:bCs/>
-        </w:rPr>
-        <w:t>Visualization &amp; Reporting:</w:t>
-      </w:r>
-      <w:r>
-        <w:t xml:space="preserve"> Power BI</w:t>
+          <w:kern w:val="0"/>
+          <w:sz w:val="24"/>
+          <w:szCs w:val="24"/>
+          <w14:ligatures w14:val="none"/>
+        </w:rPr>
+      </w:pPr>
+      <w:r>
+        <w:rPr>
+          <w:rFonts w:eastAsia="Times New Roman" w:cs="Times New Roman"/>
+          <w:b/>
+          <w:bCs/>
+          <w:kern w:val="0"/>
+          <w:sz w:val="24"/>
+          <w:szCs w:val="24"/>
+          <w14:ligatures w14:val="none"/>
+        </w:rPr>
+        <w:t>Docker:</w:t>
+      </w:r>
+      <w:r>
+        <w:t xml:space="preserve"> Containerization platform to package the ETL pipeline, dependencies, runtime environment, and </w:t>
+      </w:r>
+      <w:r>
+        <w:rPr>
+          <w:b/>
+          <w:bCs/>
+        </w:rPr>
+        <w:t>PostgreSQL</w:t>
+      </w:r>
+      <w:r>
+        <w:t xml:space="preserve"> into containers for consistent deployment and testing across systems.</w:t>
+      </w:r>
+    </w:p>
+    <w:p>
+      <w:pPr>
+        <w:pStyle w:val="ListParagraph"/>
+        <w:numPr>
+          <w:ilvl w:val="0"/>
+          <w:numId w:val="48"/>
+        </w:numPr>
+        <w:spacing w:line="360" w:lineRule="auto"/>
+        <w:ind w:left="1440"/>
+      </w:pPr>
+      <w:r>
+        <w:rPr>
+          <w:b/>
+          <w:bCs/>
+        </w:rPr>
+        <w:t xml:space="preserve">Rest </w:t>
+      </w:r>
+      <w:r>
+        <w:rPr>
+          <w:b/>
+          <w:bCs/>
+        </w:rPr>
+        <w:t>API</w:t>
+      </w:r>
+      <w:r>
+        <w:t xml:space="preserve">: </w:t>
+      </w:r>
+      <w:r>
+        <w:t xml:space="preserve">clinicaltrials.gov </w:t>
+      </w:r>
+      <w:r>
+        <w:t>API for data extraction</w:t>
+      </w:r>
+      <w:r>
+        <w:t>.</w:t>
+      </w:r>
+    </w:p>
+    <w:p>
+      <w:pPr>
+        <w:pStyle w:val="ListParagraph"/>
+        <w:numPr>
+          <w:ilvl w:val="0"/>
+          <w:numId w:val="48"/>
+        </w:numPr>
+        <w:spacing w:line="360" w:lineRule="auto"/>
+        <w:ind w:left="1440"/>
+      </w:pPr>
+      <w:r>
+        <w:rPr>
+          <w:b/>
+          <w:bCs/>
+        </w:rPr>
+        <w:t xml:space="preserve">Power BI: </w:t>
+      </w:r>
+      <w:r>
+        <w:t>Visualization &amp; Reporting</w:t>
       </w:r>
     </w:p>
     <w:p>
@@ -14751,6 +14307,118 @@
       <w:lvlJc w:val="left"/>
       <w:pPr>
         <w:ind w:left="7560" w:hanging="360"/>
+      </w:pPr>
+      <w:rPr>
+        <w:rFonts w:ascii="Wingdings" w:hAnsi="Wingdings" w:hint="default"/>
+      </w:rPr>
+    </w:lvl>
+  </w:abstractNum>
+  <w:abstractNum w:abstractNumId="48" w15:restartNumberingAfterBreak="0">
+    <w:nsid w:val="7B4019FA"/>
+    <w:multiLevelType w:val="hybridMultilevel"/>
+    <w:tmpl w:val="9BACA41A"/>
+    <w:lvl w:ilvl="0" w:tplc="FBDCC20A">
+      <w:numFmt w:val="bullet"/>
+      <w:lvlText w:val="•"/>
+      <w:lvlJc w:val="left"/>
+      <w:pPr>
+        <w:ind w:left="1080" w:hanging="360"/>
+      </w:pPr>
+      <w:rPr>
+        <w:rFonts w:ascii="Aptos" w:eastAsiaTheme="minorHAnsi" w:hAnsi="Aptos" w:cstheme="minorBidi" w:hint="default"/>
+      </w:rPr>
+    </w:lvl>
+    <w:lvl w:ilvl="1" w:tplc="04090003">
+      <w:start w:val="1"/>
+      <w:numFmt w:val="bullet"/>
+      <w:lvlText w:val="o"/>
+      <w:lvlJc w:val="left"/>
+      <w:pPr>
+        <w:ind w:left="1800" w:hanging="360"/>
+      </w:pPr>
+      <w:rPr>
+        <w:rFonts w:ascii="Courier New" w:hAnsi="Courier New" w:cs="Courier New" w:hint="default"/>
+      </w:rPr>
+    </w:lvl>
+    <w:lvl w:ilvl="2" w:tplc="04090005">
+      <w:start w:val="1"/>
+      <w:numFmt w:val="bullet"/>
+      <w:lvlText w:val=""/>
+      <w:lvlJc w:val="left"/>
+      <w:pPr>
+        <w:ind w:left="2520" w:hanging="360"/>
+      </w:pPr>
+      <w:rPr>
+        <w:rFonts w:ascii="Wingdings" w:hAnsi="Wingdings" w:hint="default"/>
+      </w:rPr>
+    </w:lvl>
+    <w:lvl w:ilvl="3" w:tplc="04090001" w:tentative="1">
+      <w:start w:val="1"/>
+      <w:numFmt w:val="bullet"/>
+      <w:lvlText w:val=""/>
+      <w:lvlJc w:val="left"/>
+      <w:pPr>
+        <w:ind w:left="3240" w:hanging="360"/>
+      </w:pPr>
+      <w:rPr>
+        <w:rFonts w:ascii="Symbol" w:hAnsi="Symbol" w:hint="default"/>
+      </w:rPr>
+    </w:lvl>
+    <w:lvl w:ilvl="4" w:tplc="04090003" w:tentative="1">
+      <w:start w:val="1"/>
+      <w:numFmt w:val="bullet"/>
+      <w:lvlText w:val="o"/>
+      <w:lvlJc w:val="left"/>
+      <w:pPr>
+        <w:ind w:left="3960" w:hanging="360"/>
+      </w:pPr>
+      <w:rPr>
+        <w:rFonts w:ascii="Courier New" w:hAnsi="Courier New" w:cs="Courier New" w:hint="default"/>
+      </w:rPr>
+    </w:lvl>
+    <w:lvl w:ilvl="5" w:tplc="04090005" w:tentative="1">
+      <w:start w:val="1"/>
+      <w:numFmt w:val="bullet"/>
+      <w:lvlText w:val=""/>
+      <w:lvlJc w:val="left"/>
+      <w:pPr>
+        <w:ind w:left="4680" w:hanging="360"/>
+      </w:pPr>
+      <w:rPr>
+        <w:rFonts w:ascii="Wingdings" w:hAnsi="Wingdings" w:hint="default"/>
+      </w:rPr>
+    </w:lvl>
+    <w:lvl w:ilvl="6" w:tplc="04090001" w:tentative="1">
+      <w:start w:val="1"/>
+      <w:numFmt w:val="bullet"/>
+      <w:lvlText w:val=""/>
+      <w:lvlJc w:val="left"/>
+      <w:pPr>
+        <w:ind w:left="5400" w:hanging="360"/>
+      </w:pPr>
+      <w:rPr>
+        <w:rFonts w:ascii="Symbol" w:hAnsi="Symbol" w:hint="default"/>
+      </w:rPr>
+    </w:lvl>
+    <w:lvl w:ilvl="7" w:tplc="04090003" w:tentative="1">
+      <w:start w:val="1"/>
+      <w:numFmt w:val="bullet"/>
+      <w:lvlText w:val="o"/>
+      <w:lvlJc w:val="left"/>
+      <w:pPr>
+        <w:ind w:left="6120" w:hanging="360"/>
+      </w:pPr>
+      <w:rPr>
+        <w:rFonts w:ascii="Courier New" w:hAnsi="Courier New" w:cs="Courier New" w:hint="default"/>
+      </w:rPr>
+    </w:lvl>
+    <w:lvl w:ilvl="8" w:tplc="04090005" w:tentative="1">
+      <w:start w:val="1"/>
+      <w:numFmt w:val="bullet"/>
+      <w:lvlText w:val=""/>
+      <w:lvlJc w:val="left"/>
+      <w:pPr>
+        <w:ind w:left="6840" w:hanging="360"/>
       </w:pPr>
       <w:rPr>
         <w:rFonts w:ascii="Wingdings" w:hAnsi="Wingdings" w:hint="default"/>
@@ -14900,6 +14568,9 @@
   </w:num>
   <w:num w:numId="48" w16cid:durableId="174660291">
     <w:abstractNumId w:val="47"/>
+  </w:num>
+  <w:num w:numId="49" w16cid:durableId="2129355124">
+    <w:abstractNumId w:val="48"/>
   </w:num>
 </w:numbering>
 </file>
@@ -15507,6 +15178,7 @@
   <w:style w:type="character" w:default="1" w:styleId="DefaultParagraphFont">
     <w:name w:val="Default Paragraph Font"/>
     <w:uiPriority w:val="1"/>
+    <w:semiHidden/>
     <w:unhideWhenUsed/>
   </w:style>
   <w:style w:type="table" w:default="1" w:styleId="TableNormal">

</xml_diff>